<commit_message>
Match shipping instruction title font to commercial invoice
Co-Authored-By: Claude Opus 5 (1M context) <noreply@anthropic.com>
</commit_message>
<xml_diff>
--- a/templates/shipping_instruction_template.docx
+++ b/templates/shipping_instruction_template.docx
@@ -9,9 +9,11 @@
       </w:pPr>
       <w:r>
         <w:rPr>
-          <w:rFonts w:ascii="Arial" w:hAnsi="Arial"/>
-          <w:b/>
-          <w:sz w:val="32"/>
+          <w:rFonts w:ascii="Times New Roman" w:eastAsia="바탕" w:hAnsi="Times New Roman" w:cs="Times New Roman"/>
+          <w:color w:val="000000"/>
+          <w:kern w:val="0"/>
+          <w:sz w:val="30"/>
+          <w:szCs w:val="30"/>
         </w:rPr>
         <w:t>SHIPPING INSTRUCTION</w:t>
       </w:r>

</xml_diff>